<commit_message>
docs: add Cloudflare alternative (Method C) to competitor analysis report and rebuild docx
</commit_message>
<xml_diff>
--- a/분석/경쟁업체_제안서_및_시장_분석_보고서.docx
+++ b/분석/경쟁업체_제안서_및_시장_분석_보고서.docx
@@ -173,14 +173,15 @@
         <w:tblLook w:firstColumn="1" w:firstRow="1" w:lastColumn="0" w:lastRow="0" w:noHBand="0" w:noVBand="1" w:val="04A0"/>
       </w:tblPr>
       <w:tblGrid>
-        <w:gridCol w:w="2880"/>
-        <w:gridCol w:w="2880"/>
-        <w:gridCol w:w="2880"/>
+        <w:gridCol w:w="2160"/>
+        <w:gridCol w:w="2160"/>
+        <w:gridCol w:w="2160"/>
+        <w:gridCol w:w="2160"/>
       </w:tblGrid>
       <w:tr>
         <w:tc>
           <w:tcPr>
-            <w:tcW w:type="dxa" w:w="2880"/>
+            <w:tcW w:type="dxa" w:w="2160"/>
           </w:tcPr>
           <w:p>
             <w:r>
@@ -194,7 +195,7 @@
         </w:tc>
         <w:tc>
           <w:tcPr>
-            <w:tcW w:type="dxa" w:w="2880"/>
+            <w:tcW w:type="dxa" w:w="2160"/>
           </w:tcPr>
           <w:p>
             <w:r>
@@ -208,7 +209,7 @@
         </w:tc>
         <w:tc>
           <w:tcPr>
-            <w:tcW w:type="dxa" w:w="2880"/>
+            <w:tcW w:type="dxa" w:w="2160"/>
           </w:tcPr>
           <w:p>
             <w:r>
@@ -220,11 +221,25 @@
             </w:r>
           </w:p>
         </w:tc>
+        <w:tc>
+          <w:tcPr>
+            <w:tcW w:type="dxa" w:w="2160"/>
+          </w:tcPr>
+          <w:p>
+            <w:r>
+              <w:rPr>
+                <w:b/>
+                <w:sz w:val="20"/>
+              </w:rPr>
+              <w:t>Cloudflare 직접 구축 (대안 C)</w:t>
+            </w:r>
+          </w:p>
+        </w:tc>
       </w:tr>
       <w:tr>
         <w:tc>
           <w:tcPr>
-            <w:tcW w:type="dxa" w:w="2880"/>
+            <w:tcW w:type="dxa" w:w="2160"/>
           </w:tcPr>
           <w:p>
             <w:r>
@@ -237,7 +252,7 @@
         </w:tc>
         <w:tc>
           <w:tcPr>
-            <w:tcW w:type="dxa" w:w="2880"/>
+            <w:tcW w:type="dxa" w:w="2160"/>
           </w:tcPr>
           <w:p>
             <w:r>
@@ -250,7 +265,7 @@
         </w:tc>
         <w:tc>
           <w:tcPr>
-            <w:tcW w:type="dxa" w:w="2880"/>
+            <w:tcW w:type="dxa" w:w="2160"/>
           </w:tcPr>
           <w:p>
             <w:r>
@@ -261,11 +276,24 @@
             </w:r>
           </w:p>
         </w:tc>
+        <w:tc>
+          <w:tcPr>
+            <w:tcW w:type="dxa" w:w="2160"/>
+          </w:tcPr>
+          <w:p>
+            <w:r>
+              <w:rPr>
+                <w:sz w:val="19"/>
+              </w:rPr>
+              <w:t>약 30,000 ~ 50,000 원 (서버비 0원)</w:t>
+            </w:r>
+          </w:p>
+        </w:tc>
       </w:tr>
       <w:tr>
         <w:tc>
           <w:tcPr>
-            <w:tcW w:type="dxa" w:w="2880"/>
+            <w:tcW w:type="dxa" w:w="2160"/>
           </w:tcPr>
           <w:p>
             <w:r>
@@ -278,7 +306,7 @@
         </w:tc>
         <w:tc>
           <w:tcPr>
-            <w:tcW w:type="dxa" w:w="2880"/>
+            <w:tcW w:type="dxa" w:w="2160"/>
           </w:tcPr>
           <w:p>
             <w:r>
@@ -291,7 +319,7 @@
         </w:tc>
         <w:tc>
           <w:tcPr>
-            <w:tcW w:type="dxa" w:w="2880"/>
+            <w:tcW w:type="dxa" w:w="2160"/>
           </w:tcPr>
           <w:p>
             <w:r>
@@ -302,11 +330,24 @@
             </w:r>
           </w:p>
         </w:tc>
+        <w:tc>
+          <w:tcPr>
+            <w:tcW w:type="dxa" w:w="2160"/>
+          </w:tcPr>
+          <w:p>
+            <w:r>
+              <w:rPr>
+                <w:sz w:val="19"/>
+              </w:rPr>
+              <w:t>개발 스펙에 따른 100% 커스텀</w:t>
+            </w:r>
+          </w:p>
+        </w:tc>
       </w:tr>
       <w:tr>
         <w:tc>
           <w:tcPr>
-            <w:tcW w:type="dxa" w:w="2880"/>
+            <w:tcW w:type="dxa" w:w="2160"/>
           </w:tcPr>
           <w:p>
             <w:r>
@@ -319,7 +360,7 @@
         </w:tc>
         <w:tc>
           <w:tcPr>
-            <w:tcW w:type="dxa" w:w="2880"/>
+            <w:tcW w:type="dxa" w:w="2160"/>
           </w:tcPr>
           <w:p>
             <w:r>
@@ -332,7 +373,7 @@
         </w:tc>
         <w:tc>
           <w:tcPr>
-            <w:tcW w:type="dxa" w:w="2880"/>
+            <w:tcW w:type="dxa" w:w="2160"/>
           </w:tcPr>
           <w:p>
             <w:r>
@@ -343,11 +384,24 @@
             </w:r>
           </w:p>
         </w:tc>
+        <w:tc>
+          <w:tcPr>
+            <w:tcW w:type="dxa" w:w="2160"/>
+          </w:tcPr>
+          <w:p>
+            <w:r>
+              <w:rPr>
+                <w:sz w:val="19"/>
+              </w:rPr>
+              <w:t>더푸른식품 100% 완전 소유 및 독점</w:t>
+            </w:r>
+          </w:p>
+        </w:tc>
       </w:tr>
       <w:tr>
         <w:tc>
           <w:tcPr>
-            <w:tcW w:type="dxa" w:w="2880"/>
+            <w:tcW w:type="dxa" w:w="2160"/>
           </w:tcPr>
           <w:p>
             <w:r>
@@ -360,7 +414,7 @@
         </w:tc>
         <w:tc>
           <w:tcPr>
-            <w:tcW w:type="dxa" w:w="2880"/>
+            <w:tcW w:type="dxa" w:w="2160"/>
           </w:tcPr>
           <w:p>
             <w:r>
@@ -373,7 +427,7 @@
         </w:tc>
         <w:tc>
           <w:tcPr>
-            <w:tcW w:type="dxa" w:w="2880"/>
+            <w:tcW w:type="dxa" w:w="2160"/>
           </w:tcPr>
           <w:p>
             <w:r>
@@ -384,11 +438,24 @@
             </w:r>
           </w:p>
         </w:tc>
+        <w:tc>
+          <w:tcPr>
+            <w:tcW w:type="dxa" w:w="2160"/>
+          </w:tcPr>
+          <w:p>
+            <w:r>
+              <w:rPr>
+                <w:sz w:val="19"/>
+              </w:rPr>
+              <w:t>개발자가 직접 코드 수정 후 배포</w:t>
+            </w:r>
+          </w:p>
+        </w:tc>
       </w:tr>
       <w:tr>
         <w:tc>
           <w:tcPr>
-            <w:tcW w:type="dxa" w:w="2880"/>
+            <w:tcW w:type="dxa" w:w="2160"/>
           </w:tcPr>
           <w:p>
             <w:r>
@@ -401,7 +468,7 @@
         </w:tc>
         <w:tc>
           <w:tcPr>
-            <w:tcW w:type="dxa" w:w="2880"/>
+            <w:tcW w:type="dxa" w:w="2160"/>
           </w:tcPr>
           <w:p>
             <w:r>
@@ -414,7 +481,7 @@
         </w:tc>
         <w:tc>
           <w:tcPr>
-            <w:tcW w:type="dxa" w:w="2880"/>
+            <w:tcW w:type="dxa" w:w="2160"/>
           </w:tcPr>
           <w:p>
             <w:r>
@@ -422,6 +489,19 @@
                 <w:sz w:val="19"/>
               </w:rPr>
               <w:t>간편 신청 및 수수료 우대 연동</w:t>
+            </w:r>
+          </w:p>
+        </w:tc>
+        <w:tc>
+          <w:tcPr>
+            <w:tcW w:type="dxa" w:w="2160"/>
+          </w:tcPr>
+          <w:p>
+            <w:r>
+              <w:rPr>
+                <w:sz w:val="19"/>
+              </w:rPr>
+              <w:t>토스/포트원 SDK 직접 API 연동 (0원)</w:t>
             </w:r>
           </w:p>
         </w:tc>
@@ -468,6 +548,24 @@
         <w:t>• 네이버페이, 카카오페이 등 모바일 결제를 쉽게 연동하여 고객 이탈을 방지합니다.</w:t>
         <w:br/>
         <w:t>• 제품 촬영은 크몽/숨고 등에서 전문 프리랜서 기사를 직접 섭외(30만 원 상당)하여 진행하면 훨씬 고품질로 완성이 가능합니다.</w:t>
+      </w:r>
+    </w:p>
+    <w:p>
+      <w:r>
+        <w:rPr>
+          <w:b/>
+        </w:rPr>
+        <w:t>방법 C: Cloudflare 직접 구축 및 최소 비용 아키텍처 (기술 역량 수반 시 추천)</w:t>
+      </w:r>
+      <w:r>
+        <w:br/>
+        <w:t>• 도메인 직접 구매: Cloudflare를 통해 수수료 마진 없는 도매 가격(연간 약 1만 원 내외)으로 도메인 주소를 영구 소유합니다.</w:t>
+        <w:br/>
+        <w:t>• 평생 호스팅 비용 0원: 개발된 Next.js 또는 HTML 소스코드를 Cloudflare Pages에 무료로 배포하여 트래픽 무제한에 대해 서버비 0원을 달성합니다.</w:t>
+        <w:br/>
+        <w:t>• 결제 시스템 직접 연동: 토스페이먼츠나 포트원(Portone) API/SDK를 개발 코드로 연동하여 불필요한 플랫폼 호스팅비나 중개 마진을 완전히 절감합니다.</w:t>
+        <w:br/>
+        <w:t>• 장단점: 2년간 도메인 유지비 3만 원 선 외에 고정 서버 지출이 아예 없으나, 마우스 드래그가 아닌 소스코드 편집 지식 및 셋업 역량(전문 개발자 섭외)이 초기 개발 시 요구됩니다.</w:t>
       </w:r>
     </w:p>
     <w:sectPr>

</xml_diff>